<commit_message>
feat: integrate AutoCAD Electrical lab projects
</commit_message>
<xml_diff>
--- a/courseware/LG-WSQ Technical Drawing with AutoCAD Electrical.docx
+++ b/courseware/LG-WSQ Technical Drawing with AutoCAD Electrical.docx
@@ -179,7 +179,7 @@
           <w:color w:val="1F6FEB"/>
           <w:sz w:val="24"/>
         </w:rPr>
-        <w:t>Version 6.0</w:t>
+        <w:t>Version 6.1</w:t>
       </w:r>
     </w:p>
     <w:p>
@@ -495,7 +495,65 @@
               <w:rPr>
                 <w:sz w:val="19"/>
               </w:rPr>
-              <w:t>Full regeneration: single-source rebuild aligned to CP LU1–LU3; 8 hands-on labs with DWG starter files, per-lab folders (DWG + PDF + MD) and full K/A coverage map</w:t>
+              <w:t>Single-source rebuild aligned to CP LU1–LU3; 8 hands-on labs with public DWG starters and full K/A coverage map</w:t>
+            </w:r>
+          </w:p>
+        </w:tc>
+        <w:tc>
+          <w:tcPr>
+            <w:tcW w:type="dxa" w:w="2160"/>
+          </w:tcPr>
+          <w:p>
+            <w:r/>
+            <w:r>
+              <w:rPr>
+                <w:sz w:val="19"/>
+              </w:rPr>
+              <w:t>Dr Alfred Ang</w:t>
+            </w:r>
+          </w:p>
+        </w:tc>
+      </w:tr>
+      <w:tr>
+        <w:tc>
+          <w:tcPr>
+            <w:tcW w:type="dxa" w:w="2160"/>
+          </w:tcPr>
+          <w:p>
+            <w:r/>
+            <w:r>
+              <w:rPr>
+                <w:sz w:val="19"/>
+              </w:rPr>
+              <w:t>6.1</w:t>
+            </w:r>
+          </w:p>
+        </w:tc>
+        <w:tc>
+          <w:tcPr>
+            <w:tcW w:type="dxa" w:w="2160"/>
+          </w:tcPr>
+          <w:p>
+            <w:r/>
+            <w:r>
+              <w:rPr>
+                <w:sz w:val="19"/>
+              </w:rPr>
+              <w:t>21 August 2026</w:t>
+            </w:r>
+          </w:p>
+        </w:tc>
+        <w:tc>
+          <w:tcPr>
+            <w:tcW w:type="dxa" w:w="2160"/>
+          </w:tcPr>
+          <w:p>
+            <w:r/>
+            <w:r>
+              <w:rPr>
+                <w:sz w:val="19"/>
+              </w:rPr>
+              <w:t>Integrated instructor-supplied AutoCAD Electrical project packages into Labs 2–8; added copy-before-open, project-format and legacy-library-path safeguards; refreshed aligned lab, slide and guide content</w:t>
             </w:r>
           </w:p>
         </w:tc>
@@ -636,7 +694,7 @@
         </w:rPr>
         <w:t>Topic 01 — Introduction to Technical Drawing Using AutoCAD Electrical</w:t>
         <w:tab/>
-        <w:t>5</w:t>
+        <w:t>6</w:t>
       </w:r>
     </w:p>
     <w:p>
@@ -676,7 +734,7 @@
         </w:rPr>
         <w:t>Lab 2 — Create a Project with Project Manager</w:t>
         <w:tab/>
-        <w:t>7</w:t>
+        <w:t>8</w:t>
       </w:r>
     </w:p>
     <w:p>
@@ -695,7 +753,7 @@
         </w:rPr>
         <w:t>Topic 02 — Analysing Technical Drawings</w:t>
         <w:tab/>
-        <w:t>9</w:t>
+        <w:t>10</w:t>
       </w:r>
     </w:p>
     <w:p>
@@ -735,7 +793,7 @@
         </w:rPr>
         <w:t>Lab 4 — Insert Wires, Wire Numbers and Terminals</w:t>
         <w:tab/>
-        <w:t>11</w:t>
+        <w:t>12</w:t>
       </w:r>
     </w:p>
     <w:p>
@@ -755,7 +813,7 @@
         </w:rPr>
         <w:t>Lab 5 — Cross-Reference and Surf a Drawing Set</w:t>
         <w:tab/>
-        <w:t>13</w:t>
+        <w:t>14</w:t>
       </w:r>
     </w:p>
     <w:p>
@@ -774,7 +832,7 @@
         </w:rPr>
         <w:t>Topic 03 — Reviewing Technical Drawings for Strategic Relevance and Standard Compliance</w:t>
         <w:tab/>
-        <w:t>14</w:t>
+        <w:t>16</w:t>
       </w:r>
     </w:p>
     <w:p>
@@ -794,7 +852,7 @@
         </w:rPr>
         <w:t>Lab 6 — Create a Panel Layout with Footprints</w:t>
         <w:tab/>
-        <w:t>15</w:t>
+        <w:t>16</w:t>
       </w:r>
     </w:p>
     <w:p>
@@ -814,7 +872,7 @@
         </w:rPr>
         <w:t>Lab 7 — Generate Reports and Part Lists</w:t>
         <w:tab/>
-        <w:t>16</w:t>
+        <w:t>18</w:t>
       </w:r>
     </w:p>
     <w:p>
@@ -834,7 +892,7 @@
         </w:rPr>
         <w:t>Lab 8 — Plot and Publish the Project to PDF</w:t>
         <w:tab/>
-        <w:t>18</w:t>
+        <w:t>20</w:t>
       </w:r>
     </w:p>
     <w:p>
@@ -853,7 +911,7 @@
         </w:rPr>
         <w:t>Assessment Preparation</w:t>
         <w:tab/>
-        <w:t>19</w:t>
+        <w:t>22</w:t>
       </w:r>
     </w:p>
     <w:p>
@@ -872,7 +930,7 @@
         </w:rPr>
         <w:t>Glossary</w:t>
         <w:tab/>
-        <w:t>20</w:t>
+        <w:t>22</w:t>
       </w:r>
     </w:p>
     <w:p>
@@ -900,7 +958,7 @@
     </w:p>
     <w:p>
       <w:r>
-        <w:t>Use this guide alongside the course slides and the lab folders in labs/ of the course repository. Each lab folder contains this guide's instructions as a PDF and Markdown file plus the starter DWG drawing files used in the lab.</w:t>
+        <w:t>Use this guide alongside the course slides and the lab folders in labs/ of the course repository. Each lab folder contains this guide's instructions as a PDF and Markdown file plus the starter DWG drawing files used in the lab. Selected labs also contain a complete AutoCAD Electrical sample project in the controlled course-delivery package; these project files are intentionally not published in the public GitHub repository.</w:t>
       </w:r>
     </w:p>
     <w:p>
@@ -944,6 +1002,9 @@
       </w:r>
     </w:p>
     <w:p>
+      <w:pPr>
+        <w:keepNext/>
+      </w:pPr>
       <w:r>
         <w:rPr>
           <w:b/>
@@ -1002,6 +1063,9 @@
       </w:r>
     </w:p>
     <w:p>
+      <w:pPr>
+        <w:keepNext/>
+      </w:pPr>
       <w:r>
         <w:rPr>
           <w:b/>
@@ -1068,6 +1132,9 @@
       </w:r>
     </w:p>
     <w:p>
+      <w:pPr>
+        <w:keepNext/>
+      </w:pPr>
       <w:r>
         <w:rPr>
           <w:b/>
@@ -1110,6 +1177,9 @@
       </w:r>
     </w:p>
     <w:p>
+      <w:pPr>
+        <w:keepNext/>
+      </w:pPr>
       <w:r>
         <w:rPr>
           <w:b/>
@@ -1125,6 +1195,9 @@
       </w:r>
     </w:p>
     <w:p>
+      <w:pPr>
+        <w:keepNext w:val="0"/>
+      </w:pPr>
       <w:r>
         <w:rPr>
           <w:rFonts w:ascii="Consolas" w:hAnsi="Consolas"/>
@@ -1135,6 +1208,9 @@
       </w:r>
     </w:p>
     <w:p>
+      <w:pPr>
+        <w:keepNext w:val="0"/>
+      </w:pPr>
       <w:r>
         <w:rPr>
           <w:rFonts w:ascii="Consolas" w:hAnsi="Consolas"/>
@@ -1145,6 +1221,9 @@
       </w:r>
     </w:p>
     <w:p>
+      <w:pPr>
+        <w:keepNext w:val="0"/>
+      </w:pPr>
       <w:r>
         <w:rPr>
           <w:rFonts w:ascii="Consolas" w:hAnsi="Consolas"/>
@@ -1155,6 +1234,9 @@
       </w:r>
     </w:p>
     <w:p>
+      <w:pPr>
+        <w:keepNext/>
+      </w:pPr>
       <w:r>
         <w:rPr>
           <w:b/>
@@ -1193,6 +1275,22 @@
         <w:pStyle w:val="ListBullet"/>
       </w:pPr>
       <w:r>
+        <w:t>When a lab includes `autodesk-electrical-sample-project`, copy the complete folder before opening its .wdp file. Never edit the supplied package in place.</w:t>
+      </w:r>
+    </w:p>
+    <w:p>
+      <w:pPr>
+        <w:pStyle w:val="ListBullet"/>
+      </w:pPr>
+      <w:r>
+        <w:t>Some supplied project files contain legacy AutoCAD Electrical 2015 library paths. Allow the current toolset to update only your copy, then remap missing NFPA/IEC and panel-library paths to the equivalent libraries installed with your release.</w:t>
+      </w:r>
+    </w:p>
+    <w:p>
+      <w:pPr>
+        <w:pStyle w:val="ListBullet"/>
+      </w:pPr>
+      <w:r>
         <w:t>Labs build on each other within a topic — complete them in order.</w:t>
       </w:r>
     </w:p>
@@ -1210,6 +1308,9 @@
       </w:r>
     </w:p>
     <w:p>
+      <w:pPr>
+        <w:keepNext/>
+      </w:pPr>
       <w:r>
         <w:rPr>
           <w:b/>
@@ -1286,6 +1387,9 @@
       </w:r>
     </w:p>
     <w:p>
+      <w:pPr>
+        <w:keepNext/>
+      </w:pPr>
       <w:r>
         <w:rPr>
           <w:b/>
@@ -1304,7 +1408,7 @@
       <w:r>
         <w:drawing>
           <wp:inline xmlns:a="http://schemas.openxmlformats.org/drawingml/2006/main" xmlns:pic="http://schemas.openxmlformats.org/drawingml/2006/picture">
-            <wp:extent cx="5029200" cy="2827544"/>
+            <wp:extent cx="4389120" cy="2467675"/>
             <wp:docPr id="2" name="Picture 2"/>
             <wp:cNvGraphicFramePr>
               <a:graphicFrameLocks noChangeAspect="1"/>
@@ -1325,7 +1429,7 @@
                   <pic:spPr>
                     <a:xfrm>
                       <a:off x="0" y="0"/>
-                      <a:ext cx="5029200" cy="2827544"/>
+                      <a:ext cx="4389120" cy="2467675"/>
                     </a:xfrm>
                     <a:prstGeom prst="rect"/>
                   </pic:spPr>
@@ -1347,6 +1451,9 @@
       </w:r>
     </w:p>
     <w:p>
+      <w:pPr>
+        <w:keepNext/>
+      </w:pPr>
       <w:r>
         <w:rPr>
           <w:b/>
@@ -1373,6 +1480,9 @@
       </w:r>
     </w:p>
     <w:p>
+      <w:pPr>
+        <w:keepNext/>
+      </w:pPr>
       <w:r>
         <w:rPr>
           <w:b/>
@@ -1384,6 +1494,7 @@
     </w:p>
     <w:p>
       <w:pPr>
+        <w:keepNext/>
         <w:spacing w:after="80"/>
       </w:pPr>
       <w:r>
@@ -1397,6 +1508,9 @@
       </w:r>
     </w:p>
     <w:p>
+      <w:pPr>
+        <w:keepNext/>
+      </w:pPr>
       <w:r>
         <w:rPr>
           <w:rFonts w:ascii="Consolas" w:hAnsi="Consolas"/>
@@ -1408,6 +1522,7 @@
     </w:p>
     <w:p>
       <w:pPr>
+        <w:keepNext/>
         <w:spacing w:after="80"/>
       </w:pPr>
       <w:r>
@@ -1421,6 +1536,9 @@
       </w:r>
     </w:p>
     <w:p>
+      <w:pPr>
+        <w:keepNext w:val="0"/>
+      </w:pPr>
       <w:r>
         <w:rPr>
           <w:rFonts w:ascii="Consolas" w:hAnsi="Consolas"/>
@@ -1432,6 +1550,7 @@
     </w:p>
     <w:p>
       <w:pPr>
+        <w:keepNext w:val="0"/>
         <w:spacing w:after="80"/>
       </w:pPr>
       <w:r>
@@ -1445,6 +1564,9 @@
       </w:r>
     </w:p>
     <w:p>
+      <w:pPr>
+        <w:keepNext w:val="0"/>
+      </w:pPr>
       <w:r>
         <w:rPr>
           <w:rFonts w:ascii="Consolas" w:hAnsi="Consolas"/>
@@ -1456,6 +1578,7 @@
     </w:p>
     <w:p>
       <w:pPr>
+        <w:keepNext w:val="0"/>
         <w:spacing w:after="80"/>
       </w:pPr>
       <w:r>
@@ -1469,6 +1592,9 @@
       </w:r>
     </w:p>
     <w:p>
+      <w:pPr>
+        <w:keepNext w:val="0"/>
+      </w:pPr>
       <w:r>
         <w:rPr>
           <w:rFonts w:ascii="Consolas" w:hAnsi="Consolas"/>
@@ -1480,6 +1606,7 @@
     </w:p>
     <w:p>
       <w:pPr>
+        <w:keepNext w:val="0"/>
         <w:spacing w:after="80"/>
       </w:pPr>
       <w:r>
@@ -1493,6 +1620,9 @@
       </w:r>
     </w:p>
     <w:p>
+      <w:pPr>
+        <w:keepNext w:val="0"/>
+      </w:pPr>
       <w:r>
         <w:rPr>
           <w:rFonts w:ascii="Consolas" w:hAnsi="Consolas"/>
@@ -1504,6 +1634,7 @@
     </w:p>
     <w:p>
       <w:pPr>
+        <w:keepNext w:val="0"/>
         <w:spacing w:after="80"/>
       </w:pPr>
       <w:r>
@@ -1517,6 +1648,9 @@
       </w:r>
     </w:p>
     <w:p>
+      <w:pPr>
+        <w:keepNext w:val="0"/>
+      </w:pPr>
       <w:r>
         <w:rPr>
           <w:rFonts w:ascii="Consolas" w:hAnsi="Consolas"/>
@@ -1527,6 +1661,9 @@
       </w:r>
     </w:p>
     <w:p>
+      <w:pPr>
+        <w:keepNext/>
+      </w:pPr>
       <w:r>
         <w:rPr>
           <w:b/>
@@ -1572,10 +1709,13 @@
     </w:p>
     <w:p>
       <w:r>
-        <w:t>Goal: AutoCAD Electrical is project-based: a .wdp project groups interrelated drawings so project-wide functions can retag and renumber. Create a project, add the supplied electrical plan drawings, and reorder them.</w:t>
-      </w:r>
-    </w:p>
-    <w:p>
+        <w:t>Goal: AutoCAD Electrical is project-based: a .wdp project groups interrelated schematic and panel drawings so project-wide functions can retag, renumber, cross-reference and report. Inspect the supplied AutoCAD Electrical sample project, then create a safe working copy for the connected labs.</w:t>
+      </w:r>
+    </w:p>
+    <w:p>
+      <w:pPr>
+        <w:keepNext/>
+      </w:pPr>
       <w:r>
         <w:rPr>
           <w:b/>
@@ -1587,14 +1727,14 @@
     </w:p>
     <w:p>
       <w:r>
-        <w:t>A working .wdp project containing the supplied power and lighting plan drawings plus a title block, in the correct sheet order.   (Tools: Project Manager · .wdp project file · Power_Plan / Lighting_Plan DWGs.)</w:t>
+        <w:t>A verified working copy of an AutoCAD Electrical .wdp project, with its schematic and panel sheets in the correct order and current library paths resolved.   (Tools: Project Manager · .wdp/.aepx project files · linked schematic and panel DWGs.)</w:t>
       </w:r>
     </w:p>
     <w:p>
       <w:r>
         <w:drawing>
           <wp:inline xmlns:a="http://schemas.openxmlformats.org/drawingml/2006/main" xmlns:pic="http://schemas.openxmlformats.org/drawingml/2006/picture">
-            <wp:extent cx="5029200" cy="4559440"/>
+            <wp:extent cx="4389120" cy="3979147"/>
             <wp:docPr id="3" name="Picture 3"/>
             <wp:cNvGraphicFramePr>
               <a:graphicFrameLocks noChangeAspect="1"/>
@@ -1615,7 +1755,7 @@
                   <pic:spPr>
                     <a:xfrm>
                       <a:off x="0" y="0"/>
-                      <a:ext cx="5029200" cy="4559440"/>
+                      <a:ext cx="4389120" cy="3979147"/>
                     </a:xfrm>
                     <a:prstGeom prst="rect"/>
                   </pic:spPr>
@@ -1637,6 +1777,9 @@
       </w:r>
     </w:p>
     <w:p>
+      <w:pPr>
+        <w:keepNext/>
+      </w:pPr>
       <w:r>
         <w:rPr>
           <w:b/>
@@ -1671,6 +1814,32 @@
       </w:r>
     </w:p>
     <w:p>
+      <w:pPr>
+        <w:pStyle w:val="ListBullet"/>
+      </w:pPr>
+      <w:r>
+        <w:t>autodesk-electrical-sample-project/ — AutoCAD Electrical sample project (wddemo.wdp with linked DEMO drawings) (controlled course-delivery package; omitted from public GitHub)</w:t>
+      </w:r>
+    </w:p>
+    <w:p>
+      <w:r>
+        <w:rPr>
+          <w:b/>
+          <w:color w:val="1F6FEB"/>
+        </w:rPr>
+        <w:t xml:space="preserve">Note: </w:t>
+      </w:r>
+      <w:r>
+        <w:rPr>
+          <w:sz w:val="20"/>
+        </w:rPr>
+        <w:t>Compatibility safeguard: work on a complete copy, allow the current Electrical toolset to update that copy if prompted, remap any missing legacy AutoCAD Electrical 2015 library paths, and keep the supplied package unchanged.</w:t>
+      </w:r>
+    </w:p>
+    <w:p>
+      <w:pPr>
+        <w:keepNext/>
+      </w:pPr>
       <w:r>
         <w:rPr>
           <w:b/>
@@ -1682,6 +1851,7 @@
     </w:p>
     <w:p>
       <w:pPr>
+        <w:keepNext/>
         <w:spacing w:after="80"/>
       </w:pPr>
       <w:r>
@@ -1691,21 +1861,25 @@
         <w:t xml:space="preserve">1.  </w:t>
       </w:r>
       <w:r>
-        <w:t>Open Project Manager from the Project tab (it is a palette — dock it on the left).</w:t>
-      </w:r>
-    </w:p>
-    <w:p>
+        <w:t>Copy the entire `autodesk-electrical-sample-project` folder to a new working folder named `TRAINING_PROJECT`; keep the supplied folder unchanged so it can be restored.</w:t>
+      </w:r>
+    </w:p>
+    <w:p>
+      <w:pPr>
+        <w:keepNext/>
+      </w:pPr>
       <w:r>
         <w:rPr>
           <w:rFonts w:ascii="Consolas" w:hAnsi="Consolas"/>
           <w:color w:val="0B3060"/>
           <w:sz w:val="19"/>
         </w:rPr>
-        <w:t>AEPROJECT</w:t>
-      </w:r>
-    </w:p>
-    <w:p>
-      <w:pPr>
+        <w:t>File Explorer → Copy folder → TRAINING_PROJECT</w:t>
+      </w:r>
+    </w:p>
+    <w:p>
+      <w:pPr>
+        <w:keepNext/>
         <w:spacing w:after="80"/>
       </w:pPr>
       <w:r>
@@ -1715,21 +1889,25 @@
         <w:t xml:space="preserve">2.  </w:t>
       </w:r>
       <w:r>
-        <w:t>Create a new project named TRAINING — the .wdp file stores the project description and settings.</w:t>
-      </w:r>
-    </w:p>
-    <w:p>
+        <w:t>Open Project Manager, select Open Project, and open `TRAINING_PROJECT\wddemo.wdp`. If prompted, allow AutoCAD Electrical to update the project/drawing format.</w:t>
+      </w:r>
+    </w:p>
+    <w:p>
+      <w:pPr>
+        <w:keepNext w:val="0"/>
+      </w:pPr>
       <w:r>
         <w:rPr>
           <w:rFonts w:ascii="Consolas" w:hAnsi="Consolas"/>
           <w:color w:val="0B3060"/>
           <w:sz w:val="19"/>
         </w:rPr>
-        <w:t>Project Manager → New Project → TRAINING</w:t>
-      </w:r>
-    </w:p>
-    <w:p>
-      <w:pPr>
+        <w:t>AEPROJECT → Open Project → wddemo.wdp</w:t>
+      </w:r>
+    </w:p>
+    <w:p>
+      <w:pPr>
+        <w:keepNext w:val="0"/>
         <w:spacing w:after="80"/>
       </w:pPr>
       <w:r>
@@ -1739,21 +1917,25 @@
         <w:t xml:space="preserve">3.  </w:t>
       </w:r>
       <w:r>
-        <w:t>Review the Project Properties: library standard (IEC/IEEE/NFPA), component tag format and cross-reference style.</w:t>
-      </w:r>
-    </w:p>
-    <w:p>
+        <w:t>Review Project Properties: schematic library standard, component tags, wire-number format and cross-reference style. If a legacy `Acade 2015` library path is reported, map it to the equivalent library installed with the current release.</w:t>
+      </w:r>
+    </w:p>
+    <w:p>
+      <w:pPr>
+        <w:keepNext w:val="0"/>
+      </w:pPr>
       <w:r>
         <w:rPr>
           <w:rFonts w:ascii="Consolas" w:hAnsi="Consolas"/>
           <w:color w:val="0B3060"/>
           <w:sz w:val="19"/>
         </w:rPr>
-        <w:t>Right-click project → Properties</w:t>
-      </w:r>
-    </w:p>
-    <w:p>
-      <w:pPr>
+        <w:t>Right-click project → Properties → Project Settings</w:t>
+      </w:r>
+    </w:p>
+    <w:p>
+      <w:pPr>
+        <w:keepNext w:val="0"/>
         <w:spacing w:after="80"/>
       </w:pPr>
       <w:r>
@@ -1763,21 +1945,25 @@
         <w:t xml:space="preserve">4.  </w:t>
       </w:r>
       <w:r>
-        <w:t>Add the supplied drawings 10-2_Power_Plan.dwg and 10-2_Lighting_Plan.dwg to the project.</w:t>
-      </w:r>
-    </w:p>
-    <w:p>
+        <w:t>Expand the project and classify DEMO01–DEMO07 as schematic sheets and DEMO08–DEMO09 as panel sheets; confirm every listed drawing opens without a missing-file warning.</w:t>
+      </w:r>
+    </w:p>
+    <w:p>
+      <w:pPr>
+        <w:keepNext w:val="0"/>
+      </w:pPr>
       <w:r>
         <w:rPr>
           <w:rFonts w:ascii="Consolas" w:hAnsi="Consolas"/>
           <w:color w:val="0B3060"/>
           <w:sz w:val="19"/>
         </w:rPr>
-        <w:t>Right-click project → Add Drawings</w:t>
-      </w:r>
-    </w:p>
-    <w:p>
-      <w:pPr>
+        <w:t>Project Manager → expand project → open each drawing</w:t>
+      </w:r>
+    </w:p>
+    <w:p>
+      <w:pPr>
+        <w:keepNext w:val="0"/>
         <w:spacing w:after="80"/>
       </w:pPr>
       <w:r>
@@ -1787,21 +1973,25 @@
         <w:t xml:space="preserve">5.  </w:t>
       </w:r>
       <w:r>
-        <w:t>Drag and drop the drawings inside Project Manager so the power plan is sheet 1, and add Title_Block.dwg as reference-only.</w:t>
-      </w:r>
-    </w:p>
-    <w:p>
+        <w:t>Create a new project named TRAINING in the working folder and copy settings from `wddemo.wdp`; add the supplied power and lighting plan drawings for comparison.</w:t>
+      </w:r>
+    </w:p>
+    <w:p>
+      <w:pPr>
+        <w:keepNext w:val="0"/>
+      </w:pPr>
       <w:r>
         <w:rPr>
           <w:rFonts w:ascii="Consolas" w:hAnsi="Consolas"/>
           <w:color w:val="0B3060"/>
           <w:sz w:val="19"/>
         </w:rPr>
-        <w:t>Drag to reorder · Properties → Reference Only</w:t>
-      </w:r>
-    </w:p>
-    <w:p>
-      <w:pPr>
+        <w:t>New Project → TRAINING.wdp → Copy Settings from Project</w:t>
+      </w:r>
+    </w:p>
+    <w:p>
+      <w:pPr>
+        <w:keepNext w:val="0"/>
         <w:spacing w:after="80"/>
       </w:pPr>
       <w:r>
@@ -1811,20 +2001,26 @@
         <w:t xml:space="preserve">6.  </w:t>
       </w:r>
       <w:r>
-        <w:t>Make TRAINING the active project and open a drawing from the project list by double-clicking it.</w:t>
-      </w:r>
-    </w:p>
-    <w:p>
+        <w:t>Reorder the drawings, set `Title_Block.dwg` as reference-only, activate TRAINING, and save a project copy before continuing to Lab 3.</w:t>
+      </w:r>
+    </w:p>
+    <w:p>
+      <w:pPr>
+        <w:keepNext w:val="0"/>
+      </w:pPr>
       <w:r>
         <w:rPr>
           <w:rFonts w:ascii="Consolas" w:hAnsi="Consolas"/>
           <w:color w:val="0B3060"/>
           <w:sz w:val="19"/>
         </w:rPr>
-        <w:t>Right-click → Activate</w:t>
-      </w:r>
-    </w:p>
-    <w:p>
+        <w:t>Drag to reorder · Properties → Reference Only · Activate</w:t>
+      </w:r>
+    </w:p>
+    <w:p>
+      <w:pPr>
+        <w:keepNext/>
+      </w:pPr>
       <w:r>
         <w:rPr>
           <w:b/>
@@ -1836,7 +2032,7 @@
     </w:p>
     <w:p>
       <w:r>
-        <w:t>Project Manager shows TRAINING in bold (active) with the drawings in your chosen order, and the .wdp file exists in the project folder — project-wide functions now see every sheet.</w:t>
+        <w:t>Project Manager shows TRAINING in bold, every sample-project drawing resolves from the working folder, no unresolved legacy library path remains, and the original supplied package is unchanged.</w:t>
       </w:r>
     </w:p>
     <w:p>
@@ -1869,6 +2065,9 @@
       </w:r>
     </w:p>
     <w:p>
+      <w:pPr>
+        <w:keepNext/>
+      </w:pPr>
       <w:r>
         <w:rPr>
           <w:b/>
@@ -1945,6 +2144,9 @@
       </w:r>
     </w:p>
     <w:p>
+      <w:pPr>
+        <w:keepNext/>
+      </w:pPr>
       <w:r>
         <w:rPr>
           <w:b/>
@@ -1963,7 +2165,7 @@
       <w:r>
         <w:drawing>
           <wp:inline xmlns:a="http://schemas.openxmlformats.org/drawingml/2006/main" xmlns:pic="http://schemas.openxmlformats.org/drawingml/2006/picture">
-            <wp:extent cx="5029200" cy="3658099"/>
+            <wp:extent cx="4389120" cy="3192522"/>
             <wp:docPr id="4" name="Picture 4"/>
             <wp:cNvGraphicFramePr>
               <a:graphicFrameLocks noChangeAspect="1"/>
@@ -1984,7 +2186,7 @@
                   <pic:spPr>
                     <a:xfrm>
                       <a:off x="0" y="0"/>
-                      <a:ext cx="5029200" cy="3658099"/>
+                      <a:ext cx="4389120" cy="3192522"/>
                     </a:xfrm>
                     <a:prstGeom prst="rect"/>
                   </pic:spPr>
@@ -2006,6 +2208,9 @@
       </w:r>
     </w:p>
     <w:p>
+      <w:pPr>
+        <w:keepNext/>
+      </w:pPr>
       <w:r>
         <w:rPr>
           <w:b/>
@@ -2024,6 +2229,32 @@
       </w:r>
     </w:p>
     <w:p>
+      <w:pPr>
+        <w:pStyle w:val="ListBullet"/>
+      </w:pPr>
+      <w:r>
+        <w:t>autodesk-electrical-sample-project/ — AutoCAD Electrical multiwire/circuit sample project (wddemo.wdp) (controlled course-delivery package; omitted from public GitHub)</w:t>
+      </w:r>
+    </w:p>
+    <w:p>
+      <w:r>
+        <w:rPr>
+          <w:b/>
+          <w:color w:val="1F6FEB"/>
+        </w:rPr>
+        <w:t xml:space="preserve">Note: </w:t>
+      </w:r>
+      <w:r>
+        <w:rPr>
+          <w:sz w:val="20"/>
+        </w:rPr>
+        <w:t>Compatibility safeguard: work on a complete copy, allow the current Electrical toolset to update that copy if prompted, remap any missing legacy AutoCAD Electrical 2015 library paths, and keep the supplied package unchanged.</w:t>
+      </w:r>
+    </w:p>
+    <w:p>
+      <w:pPr>
+        <w:keepNext/>
+      </w:pPr>
       <w:r>
         <w:rPr>
           <w:b/>
@@ -2035,6 +2266,7 @@
     </w:p>
     <w:p>
       <w:pPr>
+        <w:keepNext/>
         <w:spacing w:after="80"/>
       </w:pPr>
       <w:r>
@@ -2044,10 +2276,41 @@
         <w:t xml:space="preserve">1.  </w:t>
       </w:r>
       <w:r>
-        <w:t>Open the supplied blank sheet 2-0_Blank.dwg inside your TRAINING project and insert a ladder to carry the circuit.</w:t>
-      </w:r>
-    </w:p>
-    <w:p>
+        <w:t>Copy the supplied sample-project folder to your Lab 3 working area, open `wddemo.wdp`, and use DEMO02 plus DEMO10/DEMO11 as completed circuit references. Work only in your copy.</w:t>
+      </w:r>
+    </w:p>
+    <w:p>
+      <w:pPr>
+        <w:keepNext/>
+      </w:pPr>
+      <w:r>
+        <w:rPr>
+          <w:rFonts w:ascii="Consolas" w:hAnsi="Consolas"/>
+          <w:color w:val="0B3060"/>
+          <w:sz w:val="19"/>
+        </w:rPr>
+        <w:t>AEPROJECT → Open Project → wddemo.wdp</w:t>
+      </w:r>
+    </w:p>
+    <w:p>
+      <w:pPr>
+        <w:keepNext/>
+        <w:spacing w:after="80"/>
+      </w:pPr>
+      <w:r>
+        <w:rPr>
+          <w:b/>
+        </w:rPr>
+        <w:t xml:space="preserve">2.  </w:t>
+      </w:r>
+      <w:r>
+        <w:t>Add 2-0_Blank.dwg to your TRAINING project and insert a ladder to carry the circuit.</w:t>
+      </w:r>
+    </w:p>
+    <w:p>
+      <w:pPr>
+        <w:keepNext w:val="0"/>
+      </w:pPr>
       <w:r>
         <w:rPr>
           <w:rFonts w:ascii="Consolas" w:hAnsi="Consolas"/>
@@ -2059,19 +2322,23 @@
     </w:p>
     <w:p>
       <w:pPr>
+        <w:keepNext w:val="0"/>
         <w:spacing w:after="80"/>
       </w:pPr>
       <w:r>
         <w:rPr>
           <w:b/>
         </w:rPr>
-        <w:t xml:space="preserve">2.  </w:t>
+        <w:t xml:space="preserve">3.  </w:t>
       </w:r>
       <w:r>
         <w:t>Launch Circuit Builder from the Schematic tab and pick a 3-phase motor circuit from the tree.</w:t>
       </w:r>
     </w:p>
     <w:p>
+      <w:pPr>
+        <w:keepNext w:val="0"/>
+      </w:pPr>
       <w:r>
         <w:rPr>
           <w:rFonts w:ascii="Consolas" w:hAnsi="Consolas"/>
@@ -2083,19 +2350,23 @@
     </w:p>
     <w:p>
       <w:pPr>
+        <w:keepNext w:val="0"/>
         <w:spacing w:after="80"/>
       </w:pPr>
       <w:r>
         <w:rPr>
           <w:b/>
         </w:rPr>
-        <w:t xml:space="preserve">3.  </w:t>
+        <w:t xml:space="preserve">4.  </w:t>
       </w:r>
       <w:r>
         <w:t>Step through the Circuit Configuration dialog — select the disconnect, protection and control options; the circuit is built dynamically from your selections.</w:t>
       </w:r>
     </w:p>
     <w:p>
+      <w:pPr>
+        <w:keepNext w:val="0"/>
+      </w:pPr>
       <w:r>
         <w:rPr>
           <w:rFonts w:ascii="Consolas" w:hAnsi="Consolas"/>
@@ -2107,19 +2378,23 @@
     </w:p>
     <w:p>
       <w:pPr>
+        <w:keepNext w:val="0"/>
         <w:spacing w:after="80"/>
       </w:pPr>
       <w:r>
         <w:rPr>
           <w:b/>
         </w:rPr>
-        <w:t xml:space="preserve">4.  </w:t>
+        <w:t xml:space="preserve">5.  </w:t>
       </w:r>
       <w:r>
         <w:t>Insert a push button and a selector switch from the Icon Menu to complete the control rung.</w:t>
       </w:r>
     </w:p>
     <w:p>
+      <w:pPr>
+        <w:keepNext w:val="0"/>
+      </w:pPr>
       <w:r>
         <w:rPr>
           <w:rFonts w:ascii="Consolas" w:hAnsi="Consolas"/>
@@ -2131,19 +2406,23 @@
     </w:p>
     <w:p>
       <w:pPr>
+        <w:keepNext w:val="0"/>
         <w:spacing w:after="80"/>
       </w:pPr>
       <w:r>
         <w:rPr>
           <w:b/>
         </w:rPr>
-        <w:t xml:space="preserve">5.  </w:t>
+        <w:t xml:space="preserve">6.  </w:t>
       </w:r>
       <w:r>
         <w:t>Select the finished circuit and save it with Save Circuit to Icon Menu for reuse.</w:t>
       </w:r>
     </w:p>
     <w:p>
+      <w:pPr>
+        <w:keepNext w:val="0"/>
+      </w:pPr>
       <w:r>
         <w:rPr>
           <w:rFonts w:ascii="Consolas" w:hAnsi="Consolas"/>
@@ -2155,19 +2434,23 @@
     </w:p>
     <w:p>
       <w:pPr>
+        <w:keepNext w:val="0"/>
         <w:spacing w:after="80"/>
       </w:pPr>
       <w:r>
         <w:rPr>
           <w:b/>
         </w:rPr>
-        <w:t xml:space="preserve">6.  </w:t>
+        <w:t xml:space="preserve">7.  </w:t>
       </w:r>
       <w:r>
         <w:t>Insert the saved circuit onto a clear area of the sheet and watch tags update to stay unique.</w:t>
       </w:r>
     </w:p>
     <w:p>
+      <w:pPr>
+        <w:keepNext w:val="0"/>
+      </w:pPr>
       <w:r>
         <w:rPr>
           <w:rFonts w:ascii="Consolas" w:hAnsi="Consolas"/>
@@ -2178,6 +2461,9 @@
       </w:r>
     </w:p>
     <w:p>
+      <w:pPr>
+        <w:keepNext/>
+      </w:pPr>
       <w:r>
         <w:rPr>
           <w:b/>
@@ -2227,6 +2513,9 @@
       </w:r>
     </w:p>
     <w:p>
+      <w:pPr>
+        <w:keepNext/>
+      </w:pPr>
       <w:r>
         <w:rPr>
           <w:b/>
@@ -2245,7 +2534,7 @@
       <w:r>
         <w:drawing>
           <wp:inline xmlns:a="http://schemas.openxmlformats.org/drawingml/2006/main" xmlns:pic="http://schemas.openxmlformats.org/drawingml/2006/picture">
-            <wp:extent cx="5029200" cy="1892105"/>
+            <wp:extent cx="4389120" cy="1651291"/>
             <wp:docPr id="5" name="Picture 5"/>
             <wp:cNvGraphicFramePr>
               <a:graphicFrameLocks noChangeAspect="1"/>
@@ -2266,7 +2555,7 @@
                   <pic:spPr>
                     <a:xfrm>
                       <a:off x="0" y="0"/>
-                      <a:ext cx="5029200" cy="1892105"/>
+                      <a:ext cx="4389120" cy="1651291"/>
                     </a:xfrm>
                     <a:prstGeom prst="rect"/>
                   </pic:spPr>
@@ -2288,6 +2577,9 @@
       </w:r>
     </w:p>
     <w:p>
+      <w:pPr>
+        <w:keepNext/>
+      </w:pPr>
       <w:r>
         <w:rPr>
           <w:b/>
@@ -2306,6 +2598,32 @@
       </w:r>
     </w:p>
     <w:p>
+      <w:pPr>
+        <w:pStyle w:val="ListBullet"/>
+      </w:pPr>
+      <w:r>
+        <w:t>autodesk-electrical-sample-project/ — AutoCAD Electrical single-wire/component sample project (wddemo.wdp) (controlled course-delivery package; omitted from public GitHub)</w:t>
+      </w:r>
+    </w:p>
+    <w:p>
+      <w:r>
+        <w:rPr>
+          <w:b/>
+          <w:color w:val="1F6FEB"/>
+        </w:rPr>
+        <w:t xml:space="preserve">Note: </w:t>
+      </w:r>
+      <w:r>
+        <w:rPr>
+          <w:sz w:val="20"/>
+        </w:rPr>
+        <w:t>Compatibility safeguard: work on a complete copy, allow the current Electrical toolset to update that copy if prompted, remap any missing legacy AutoCAD Electrical 2015 library paths, and keep the supplied package unchanged.</w:t>
+      </w:r>
+    </w:p>
+    <w:p>
+      <w:pPr>
+        <w:keepNext/>
+      </w:pPr>
       <w:r>
         <w:rPr>
           <w:b/>
@@ -2317,6 +2635,7 @@
     </w:p>
     <w:p>
       <w:pPr>
+        <w:keepNext/>
         <w:spacing w:after="80"/>
       </w:pPr>
       <w:r>
@@ -2326,21 +2645,25 @@
         <w:t xml:space="preserve">1.  </w:t>
       </w:r>
       <w:r>
-        <w:t>Continue on your Lab 3 sheet (keep 10-2_Power_Plan.dwg open as an analysis reference for wiring practice).</w:t>
-      </w:r>
-    </w:p>
-    <w:p>
+        <w:t>Continue on your Lab 3 sheet. Open the Lab 4 sample-project copy and compare DEMO02/DEMO10 as AutoCAD Electrical-aware references; keep 10-2_Power_Plan.dwg open only as a conventional-plan comparison.</w:t>
+      </w:r>
+    </w:p>
+    <w:p>
+      <w:pPr>
+        <w:keepNext/>
+      </w:pPr>
       <w:r>
         <w:rPr>
           <w:rFonts w:ascii="Consolas" w:hAnsi="Consolas"/>
           <w:color w:val="0B3060"/>
           <w:sz w:val="19"/>
         </w:rPr>
-        <w:t>OPEN 10-2_Power_Plan.dwg</w:t>
-      </w:r>
-    </w:p>
-    <w:p>
-      <w:pPr>
+        <w:t>AEPROJECT → Open Project → wddemo.wdp</w:t>
+      </w:r>
+    </w:p>
+    <w:p>
+      <w:pPr>
+        <w:keepNext/>
         <w:spacing w:after="80"/>
       </w:pPr>
       <w:r>
@@ -2354,6 +2677,9 @@
       </w:r>
     </w:p>
     <w:p>
+      <w:pPr>
+        <w:keepNext w:val="0"/>
+      </w:pPr>
       <w:r>
         <w:rPr>
           <w:rFonts w:ascii="Consolas" w:hAnsi="Consolas"/>
@@ -2365,6 +2691,7 @@
     </w:p>
     <w:p>
       <w:pPr>
+        <w:keepNext w:val="0"/>
         <w:spacing w:after="80"/>
       </w:pPr>
       <w:r>
@@ -2378,6 +2705,9 @@
       </w:r>
     </w:p>
     <w:p>
+      <w:pPr>
+        <w:keepNext w:val="0"/>
+      </w:pPr>
       <w:r>
         <w:rPr>
           <w:rFonts w:ascii="Consolas" w:hAnsi="Consolas"/>
@@ -2389,6 +2719,7 @@
     </w:p>
     <w:p>
       <w:pPr>
+        <w:keepNext w:val="0"/>
         <w:spacing w:after="80"/>
       </w:pPr>
       <w:r>
@@ -2402,6 +2733,9 @@
       </w:r>
     </w:p>
     <w:p>
+      <w:pPr>
+        <w:keepNext w:val="0"/>
+      </w:pPr>
       <w:r>
         <w:rPr>
           <w:rFonts w:ascii="Consolas" w:hAnsi="Consolas"/>
@@ -2413,6 +2747,7 @@
     </w:p>
     <w:p>
       <w:pPr>
+        <w:keepNext w:val="0"/>
         <w:spacing w:after="80"/>
       </w:pPr>
       <w:r>
@@ -2426,6 +2761,9 @@
       </w:r>
     </w:p>
     <w:p>
+      <w:pPr>
+        <w:keepNext w:val="0"/>
+      </w:pPr>
       <w:r>
         <w:rPr>
           <w:rFonts w:ascii="Consolas" w:hAnsi="Consolas"/>
@@ -2437,6 +2775,7 @@
     </w:p>
     <w:p>
       <w:pPr>
+        <w:keepNext w:val="0"/>
         <w:spacing w:after="80"/>
       </w:pPr>
       <w:r>
@@ -2450,6 +2789,9 @@
       </w:r>
     </w:p>
     <w:p>
+      <w:pPr>
+        <w:keepNext w:val="0"/>
+      </w:pPr>
       <w:r>
         <w:rPr>
           <w:rFonts w:ascii="Consolas" w:hAnsi="Consolas"/>
@@ -2461,6 +2803,7 @@
     </w:p>
     <w:p>
       <w:pPr>
+        <w:keepNext w:val="0"/>
         <w:spacing w:after="80"/>
       </w:pPr>
       <w:r>
@@ -2474,6 +2817,9 @@
       </w:r>
     </w:p>
     <w:p>
+      <w:pPr>
+        <w:keepNext w:val="0"/>
+      </w:pPr>
       <w:r>
         <w:rPr>
           <w:rFonts w:ascii="Consolas" w:hAnsi="Consolas"/>
@@ -2484,6 +2830,9 @@
       </w:r>
     </w:p>
     <w:p>
+      <w:pPr>
+        <w:keepNext/>
+      </w:pPr>
       <w:r>
         <w:rPr>
           <w:b/>
@@ -2533,6 +2882,9 @@
       </w:r>
     </w:p>
     <w:p>
+      <w:pPr>
+        <w:keepNext/>
+      </w:pPr>
       <w:r>
         <w:rPr>
           <w:b/>
@@ -2551,7 +2903,7 @@
       <w:r>
         <w:drawing>
           <wp:inline xmlns:a="http://schemas.openxmlformats.org/drawingml/2006/main" xmlns:pic="http://schemas.openxmlformats.org/drawingml/2006/picture">
-            <wp:extent cx="5029200" cy="2689331"/>
+            <wp:extent cx="4389120" cy="2347052"/>
             <wp:docPr id="6" name="Picture 6"/>
             <wp:cNvGraphicFramePr>
               <a:graphicFrameLocks noChangeAspect="1"/>
@@ -2572,7 +2924,7 @@
                   <pic:spPr>
                     <a:xfrm>
                       <a:off x="0" y="0"/>
-                      <a:ext cx="5029200" cy="2689331"/>
+                      <a:ext cx="4389120" cy="2347052"/>
                     </a:xfrm>
                     <a:prstGeom prst="rect"/>
                   </pic:spPr>
@@ -2594,6 +2946,9 @@
       </w:r>
     </w:p>
     <w:p>
+      <w:pPr>
+        <w:keepNext/>
+      </w:pPr>
       <w:r>
         <w:rPr>
           <w:b/>
@@ -2620,6 +2975,32 @@
       </w:r>
     </w:p>
     <w:p>
+      <w:pPr>
+        <w:pStyle w:val="ListBullet"/>
+      </w:pPr>
+      <w:r>
+        <w:t>autodesk-electrical-sample-project/ — AutoCAD Electrical multi-sheet sample project for cross-reference review (wddemo.wdp) (controlled course-delivery package; omitted from public GitHub)</w:t>
+      </w:r>
+    </w:p>
+    <w:p>
+      <w:r>
+        <w:rPr>
+          <w:b/>
+          <w:color w:val="1F6FEB"/>
+        </w:rPr>
+        <w:t xml:space="preserve">Note: </w:t>
+      </w:r>
+      <w:r>
+        <w:rPr>
+          <w:sz w:val="20"/>
+        </w:rPr>
+        <w:t>Compatibility safeguard: work on a complete copy, allow the current Electrical toolset to update that copy if prompted, remap any missing legacy AutoCAD Electrical 2015 library paths, and keep the supplied package unchanged.</w:t>
+      </w:r>
+    </w:p>
+    <w:p>
+      <w:pPr>
+        <w:keepNext/>
+      </w:pPr>
       <w:r>
         <w:rPr>
           <w:b/>
@@ -2631,6 +3012,7 @@
     </w:p>
     <w:p>
       <w:pPr>
+        <w:keepNext/>
         <w:spacing w:after="80"/>
       </w:pPr>
       <w:r>
@@ -2640,10 +3022,41 @@
         <w:t xml:space="preserve">1.  </w:t>
       </w:r>
       <w:r>
-        <w:t>Insert a relay coil (parent) on sheet 1 and a NO contact (child) on sheet 2 of your project; assign the child to the parent in the Insert/Edit Child dialog.</w:t>
-      </w:r>
-    </w:p>
-    <w:p>
+        <w:t>Open a working copy of the supplied `wddemo.wdp`, then use the project descriptions and existing links to identify a parent/child relationship spanning two sample sheets.</w:t>
+      </w:r>
+    </w:p>
+    <w:p>
+      <w:pPr>
+        <w:keepNext/>
+      </w:pPr>
+      <w:r>
+        <w:rPr>
+          <w:rFonts w:ascii="Consolas" w:hAnsi="Consolas"/>
+          <w:color w:val="0B3060"/>
+          <w:sz w:val="19"/>
+        </w:rPr>
+        <w:t>AEPROJECT → Open Project → wddemo.wdp</w:t>
+      </w:r>
+    </w:p>
+    <w:p>
+      <w:pPr>
+        <w:keepNext/>
+        <w:spacing w:after="80"/>
+      </w:pPr>
+      <w:r>
+        <w:rPr>
+          <w:b/>
+        </w:rPr>
+        <w:t xml:space="preserve">2.  </w:t>
+      </w:r>
+      <w:r>
+        <w:t>In your TRAINING project, insert a relay coil (parent) on sheet 1 and a NO contact (child) on sheet 2; assign the child to the parent in the Insert/Edit Child dialog.</w:t>
+      </w:r>
+    </w:p>
+    <w:p>
+      <w:pPr>
+        <w:keepNext w:val="0"/>
+      </w:pPr>
       <w:r>
         <w:rPr>
           <w:rFonts w:ascii="Consolas" w:hAnsi="Consolas"/>
@@ -2655,19 +3068,23 @@
     </w:p>
     <w:p>
       <w:pPr>
+        <w:keepNext w:val="0"/>
         <w:spacing w:after="80"/>
       </w:pPr>
       <w:r>
         <w:rPr>
           <w:b/>
         </w:rPr>
-        <w:t xml:space="preserve">2.  </w:t>
+        <w:t xml:space="preserve">3.  </w:t>
       </w:r>
       <w:r>
         <w:t>Update cross-references and read the parent's contact grid — it reports where every child lives.</w:t>
       </w:r>
     </w:p>
     <w:p>
+      <w:pPr>
+        <w:keepNext w:val="0"/>
+      </w:pPr>
       <w:r>
         <w:rPr>
           <w:rFonts w:ascii="Consolas" w:hAnsi="Consolas"/>
@@ -2679,19 +3096,23 @@
     </w:p>
     <w:p>
       <w:pPr>
+        <w:keepNext w:val="0"/>
         <w:spacing w:after="80"/>
       </w:pPr>
       <w:r>
         <w:rPr>
           <w:b/>
         </w:rPr>
-        <w:t xml:space="preserve">3.  </w:t>
+        <w:t xml:space="preserve">4.  </w:t>
       </w:r>
       <w:r>
         <w:t>Break a wire network across the two sheets with a Source arrow (assign a code) and a matching Destination arrow.</w:t>
       </w:r>
     </w:p>
     <w:p>
+      <w:pPr>
+        <w:keepNext w:val="0"/>
+      </w:pPr>
       <w:r>
         <w:rPr>
           <w:rFonts w:ascii="Consolas" w:hAnsi="Consolas"/>
@@ -2703,19 +3124,23 @@
     </w:p>
     <w:p>
       <w:pPr>
+        <w:keepNext w:val="0"/>
         <w:spacing w:after="80"/>
       </w:pPr>
       <w:r>
         <w:rPr>
           <w:b/>
         </w:rPr>
-        <w:t xml:space="preserve">4.  </w:t>
+        <w:t xml:space="preserve">5.  </w:t>
       </w:r>
       <w:r>
         <w:t>Right-click the coil and Surf: jump between the parent, children and signal arrows from the Surf list.</w:t>
       </w:r>
     </w:p>
     <w:p>
+      <w:pPr>
+        <w:keepNext w:val="0"/>
+      </w:pPr>
       <w:r>
         <w:rPr>
           <w:rFonts w:ascii="Consolas" w:hAnsi="Consolas"/>
@@ -2727,19 +3152,23 @@
     </w:p>
     <w:p>
       <w:pPr>
+        <w:keepNext w:val="0"/>
         <w:spacing w:after="80"/>
       </w:pPr>
       <w:r>
         <w:rPr>
           <w:b/>
         </w:rPr>
-        <w:t xml:space="preserve">5.  </w:t>
+        <w:t xml:space="preserve">6.  </w:t>
       </w:r>
       <w:r>
         <w:t>Mark the project (Mark/Verify), move one component, then run Verify to get the change report.</w:t>
       </w:r>
     </w:p>
     <w:p>
+      <w:pPr>
+        <w:keepNext w:val="0"/>
+      </w:pPr>
       <w:r>
         <w:rPr>
           <w:rFonts w:ascii="Consolas" w:hAnsi="Consolas"/>
@@ -2751,19 +3180,23 @@
     </w:p>
     <w:p>
       <w:pPr>
+        <w:keepNext w:val="0"/>
         <w:spacing w:after="80"/>
       </w:pPr>
       <w:r>
         <w:rPr>
           <w:b/>
         </w:rPr>
-        <w:t xml:space="preserve">6.  </w:t>
+        <w:t xml:space="preserve">7.  </w:t>
       </w:r>
       <w:r>
         <w:t>Open the supplied reference drawings and identify which sheets are reference-only in Project Manager.</w:t>
       </w:r>
     </w:p>
     <w:p>
+      <w:pPr>
+        <w:keepNext w:val="0"/>
+      </w:pPr>
       <w:r>
         <w:rPr>
           <w:rFonts w:ascii="Consolas" w:hAnsi="Consolas"/>
@@ -2774,6 +3207,9 @@
       </w:r>
     </w:p>
     <w:p>
+      <w:pPr>
+        <w:keepNext/>
+      </w:pPr>
       <w:r>
         <w:rPr>
           <w:b/>
@@ -2818,6 +3254,9 @@
       </w:r>
     </w:p>
     <w:p>
+      <w:pPr>
+        <w:keepNext/>
+      </w:pPr>
       <w:r>
         <w:rPr>
           <w:b/>
@@ -2894,6 +3333,9 @@
       </w:r>
     </w:p>
     <w:p>
+      <w:pPr>
+        <w:keepNext/>
+      </w:pPr>
       <w:r>
         <w:rPr>
           <w:b/>
@@ -2912,7 +3354,7 @@
       <w:r>
         <w:drawing>
           <wp:inline xmlns:a="http://schemas.openxmlformats.org/drawingml/2006/main" xmlns:pic="http://schemas.openxmlformats.org/drawingml/2006/picture">
-            <wp:extent cx="5029200" cy="2650455"/>
+            <wp:extent cx="4389120" cy="2313124"/>
             <wp:docPr id="7" name="Picture 7"/>
             <wp:cNvGraphicFramePr>
               <a:graphicFrameLocks noChangeAspect="1"/>
@@ -2933,7 +3375,7 @@
                   <pic:spPr>
                     <a:xfrm>
                       <a:off x="0" y="0"/>
-                      <a:ext cx="5029200" cy="2650455"/>
+                      <a:ext cx="4389120" cy="2313124"/>
                     </a:xfrm>
                     <a:prstGeom prst="rect"/>
                   </pic:spPr>
@@ -2955,6 +3397,9 @@
       </w:r>
     </w:p>
     <w:p>
+      <w:pPr>
+        <w:keepNext/>
+      </w:pPr>
       <w:r>
         <w:rPr>
           <w:b/>
@@ -2981,6 +3426,32 @@
       </w:r>
     </w:p>
     <w:p>
+      <w:pPr>
+        <w:pStyle w:val="ListBullet"/>
+      </w:pPr>
+      <w:r>
+        <w:t>autodesk-electrical-sample-project/ — AutoCAD Electrical schematic-and-panel sample project (wddemo.wdp) (controlled course-delivery package; omitted from public GitHub)</w:t>
+      </w:r>
+    </w:p>
+    <w:p>
+      <w:r>
+        <w:rPr>
+          <w:b/>
+          <w:color w:val="1F6FEB"/>
+        </w:rPr>
+        <w:t xml:space="preserve">Note: </w:t>
+      </w:r>
+      <w:r>
+        <w:rPr>
+          <w:sz w:val="20"/>
+        </w:rPr>
+        <w:t>Compatibility safeguard: work on a complete copy, allow the current Electrical toolset to update that copy if prompted, remap any missing legacy AutoCAD Electrical 2015 library paths, and keep the supplied package unchanged.</w:t>
+      </w:r>
+    </w:p>
+    <w:p>
+      <w:pPr>
+        <w:keepNext/>
+      </w:pPr>
       <w:r>
         <w:rPr>
           <w:b/>
@@ -2992,6 +3463,7 @@
     </w:p>
     <w:p>
       <w:pPr>
+        <w:keepNext/>
         <w:spacing w:after="80"/>
       </w:pPr>
       <w:r>
@@ -3001,10 +3473,41 @@
         <w:t xml:space="preserve">1.  </w:t>
       </w:r>
       <w:r>
-        <w:t>Create a new panel drawing in your project and switch to the Panel tab of the ribbon.</w:t>
-      </w:r>
-    </w:p>
-    <w:p>
+        <w:t>Open a working copy of the supplied `wddemo.wdp`; compare schematic DEMO01–DEMO07 with panel DEMO08–DEMO09 and confirm the project links are intact.</w:t>
+      </w:r>
+    </w:p>
+    <w:p>
+      <w:pPr>
+        <w:keepNext/>
+      </w:pPr>
+      <w:r>
+        <w:rPr>
+          <w:rFonts w:ascii="Consolas" w:hAnsi="Consolas"/>
+          <w:color w:val="0B3060"/>
+          <w:sz w:val="19"/>
+        </w:rPr>
+        <w:t>AEPROJECT → Open Project → wddemo.wdp</w:t>
+      </w:r>
+    </w:p>
+    <w:p>
+      <w:pPr>
+        <w:keepNext/>
+        <w:spacing w:after="80"/>
+      </w:pPr>
+      <w:r>
+        <w:rPr>
+          <w:b/>
+        </w:rPr>
+        <w:t xml:space="preserve">2.  </w:t>
+      </w:r>
+      <w:r>
+        <w:t>Create a new panel drawing in your TRAINING project and switch to the Panel tab of the ribbon.</w:t>
+      </w:r>
+    </w:p>
+    <w:p>
+      <w:pPr>
+        <w:keepNext w:val="0"/>
+      </w:pPr>
       <w:r>
         <w:rPr>
           <w:rFonts w:ascii="Consolas" w:hAnsi="Consolas"/>
@@ -3016,19 +3519,23 @@
     </w:p>
     <w:p>
       <w:pPr>
+        <w:keepNext w:val="0"/>
         <w:spacing w:after="80"/>
       </w:pPr>
       <w:r>
         <w:rPr>
           <w:b/>
         </w:rPr>
-        <w:t xml:space="preserve">2.  </w:t>
+        <w:t xml:space="preserve">3.  </w:t>
       </w:r>
       <w:r>
         <w:t>Insert footprints from the schematic list — AutoCAD Electrical matches each component's catalog value to a footprint.</w:t>
       </w:r>
     </w:p>
     <w:p>
+      <w:pPr>
+        <w:keepNext w:val="0"/>
+      </w:pPr>
       <w:r>
         <w:rPr>
           <w:rFonts w:ascii="Consolas" w:hAnsi="Consolas"/>
@@ -3040,19 +3547,23 @@
     </w:p>
     <w:p>
       <w:pPr>
+        <w:keepNext w:val="0"/>
         <w:spacing w:after="80"/>
       </w:pPr>
       <w:r>
         <w:rPr>
           <w:b/>
         </w:rPr>
-        <w:t xml:space="preserve">3.  </w:t>
+        <w:t xml:space="preserve">4.  </w:t>
       </w:r>
       <w:r>
         <w:t>Place the footprints inside the panel outline; values (tag, location, description) copy over from the schematic.</w:t>
       </w:r>
     </w:p>
     <w:p>
+      <w:pPr>
+        <w:keepNext w:val="0"/>
+      </w:pPr>
       <w:r>
         <w:rPr>
           <w:rFonts w:ascii="Consolas" w:hAnsi="Consolas"/>
@@ -3064,19 +3575,23 @@
     </w:p>
     <w:p>
       <w:pPr>
+        <w:keepNext w:val="0"/>
         <w:spacing w:after="80"/>
       </w:pPr>
       <w:r>
         <w:rPr>
           <w:b/>
         </w:rPr>
-        <w:t xml:space="preserve">4.  </w:t>
+        <w:t xml:space="preserve">5.  </w:t>
       </w:r>
       <w:r>
         <w:t>Insert a nameplate from the Panel icon menu and associate it with a footprint.</w:t>
       </w:r>
     </w:p>
     <w:p>
+      <w:pPr>
+        <w:keepNext w:val="0"/>
+      </w:pPr>
       <w:r>
         <w:rPr>
           <w:rFonts w:ascii="Consolas" w:hAnsi="Consolas"/>
@@ -3088,19 +3603,23 @@
     </w:p>
     <w:p>
       <w:pPr>
+        <w:keepNext w:val="0"/>
         <w:spacing w:after="80"/>
       </w:pPr>
       <w:r>
         <w:rPr>
           <w:b/>
         </w:rPr>
-        <w:t xml:space="preserve">5.  </w:t>
+        <w:t xml:space="preserve">6.  </w:t>
       </w:r>
       <w:r>
         <w:t>Assign item numbers project-wide — components with the same catalog value receive the same item number.</w:t>
       </w:r>
     </w:p>
     <w:p>
+      <w:pPr>
+        <w:keepNext w:val="0"/>
+      </w:pPr>
       <w:r>
         <w:rPr>
           <w:rFonts w:ascii="Consolas" w:hAnsi="Consolas"/>
@@ -3112,19 +3631,23 @@
     </w:p>
     <w:p>
       <w:pPr>
+        <w:keepNext w:val="0"/>
         <w:spacing w:after="80"/>
       </w:pPr>
       <w:r>
         <w:rPr>
           <w:b/>
         </w:rPr>
-        <w:t xml:space="preserve">6.  </w:t>
+        <w:t xml:space="preserve">7.  </w:t>
       </w:r>
       <w:r>
         <w:t>Add item balloons to the footprints and study the supplied blocks/attributes drawings to see how footprint blocks carry data.</w:t>
       </w:r>
     </w:p>
     <w:p>
+      <w:pPr>
+        <w:keepNext w:val="0"/>
+      </w:pPr>
       <w:r>
         <w:rPr>
           <w:rFonts w:ascii="Consolas" w:hAnsi="Consolas"/>
@@ -3135,6 +3658,9 @@
       </w:r>
     </w:p>
     <w:p>
+      <w:pPr>
+        <w:keepNext/>
+      </w:pPr>
       <w:r>
         <w:rPr>
           <w:b/>
@@ -3184,6 +3710,9 @@
       </w:r>
     </w:p>
     <w:p>
+      <w:pPr>
+        <w:keepNext/>
+      </w:pPr>
       <w:r>
         <w:rPr>
           <w:b/>
@@ -3202,7 +3731,7 @@
       <w:r>
         <w:drawing>
           <wp:inline xmlns:a="http://schemas.openxmlformats.org/drawingml/2006/main" xmlns:pic="http://schemas.openxmlformats.org/drawingml/2006/picture">
-            <wp:extent cx="5029200" cy="1966642"/>
+            <wp:extent cx="4389120" cy="1716342"/>
             <wp:docPr id="8" name="Picture 8"/>
             <wp:cNvGraphicFramePr>
               <a:graphicFrameLocks noChangeAspect="1"/>
@@ -3223,7 +3752,7 @@
                   <pic:spPr>
                     <a:xfrm>
                       <a:off x="0" y="0"/>
-                      <a:ext cx="5029200" cy="1966642"/>
+                      <a:ext cx="4389120" cy="1716342"/>
                     </a:xfrm>
                     <a:prstGeom prst="rect"/>
                   </pic:spPr>
@@ -3245,6 +3774,9 @@
       </w:r>
     </w:p>
     <w:p>
+      <w:pPr>
+        <w:keepNext/>
+      </w:pPr>
       <w:r>
         <w:rPr>
           <w:b/>
@@ -3271,6 +3803,32 @@
       </w:r>
     </w:p>
     <w:p>
+      <w:pPr>
+        <w:pStyle w:val="ListBullet"/>
+      </w:pPr>
+      <w:r>
+        <w:t>autodesk-electrical-sample-project/ — AutoCAD Electrical reporting project (PROJECT006.wdp with BOM, schematic and panel drawings) (controlled course-delivery package; omitted from public GitHub)</w:t>
+      </w:r>
+    </w:p>
+    <w:p>
+      <w:r>
+        <w:rPr>
+          <w:b/>
+          <w:color w:val="1F6FEB"/>
+        </w:rPr>
+        <w:t xml:space="preserve">Note: </w:t>
+      </w:r>
+      <w:r>
+        <w:rPr>
+          <w:sz w:val="20"/>
+        </w:rPr>
+        <w:t>Compatibility safeguard: work on a complete copy, allow the current Electrical toolset to update that copy if prompted, remap any missing legacy AutoCAD Electrical 2015 library paths, and keep the supplied package unchanged.</w:t>
+      </w:r>
+    </w:p>
+    <w:p>
+      <w:pPr>
+        <w:keepNext/>
+      </w:pPr>
       <w:r>
         <w:rPr>
           <w:b/>
@@ -3282,6 +3840,7 @@
     </w:p>
     <w:p>
       <w:pPr>
+        <w:keepNext/>
         <w:spacing w:after="80"/>
       </w:pPr>
       <w:r>
@@ -3291,21 +3850,25 @@
         <w:t xml:space="preserve">1.  </w:t>
       </w:r>
       <w:r>
-        <w:t>Run the Reports tool on the Reports tab and choose Bill of Material, processing the whole project.</w:t>
-      </w:r>
-    </w:p>
-    <w:p>
+        <w:t>Copy the supplied reporting project, open `PROJECT006.wdp`, and confirm its BOM, schematic and panel drawings resolve before running reports.</w:t>
+      </w:r>
+    </w:p>
+    <w:p>
+      <w:pPr>
+        <w:keepNext/>
+      </w:pPr>
       <w:r>
         <w:rPr>
           <w:rFonts w:ascii="Consolas" w:hAnsi="Consolas"/>
           <w:color w:val="0B3060"/>
           <w:sz w:val="19"/>
         </w:rPr>
-        <w:t>AEAUDIT →  Reports → BOM</w:t>
-      </w:r>
-    </w:p>
-    <w:p>
-      <w:pPr>
+        <w:t>AEPROJECT → Open Project → PROJECT006.wdp</w:t>
+      </w:r>
+    </w:p>
+    <w:p>
+      <w:pPr>
+        <w:keepNext/>
         <w:spacing w:after="80"/>
       </w:pPr>
       <w:r>
@@ -3315,10 +3878,41 @@
         <w:t xml:space="preserve">2.  </w:t>
       </w:r>
       <w:r>
+        <w:t>Run the Reports tool on the Reports tab and choose Bill of Material, processing the whole project.</w:t>
+      </w:r>
+    </w:p>
+    <w:p>
+      <w:pPr>
+        <w:keepNext w:val="0"/>
+      </w:pPr>
+      <w:r>
+        <w:rPr>
+          <w:rFonts w:ascii="Consolas" w:hAnsi="Consolas"/>
+          <w:color w:val="0B3060"/>
+          <w:sz w:val="19"/>
+        </w:rPr>
+        <w:t>Reports → Schematic Reports → Bill of Material</w:t>
+      </w:r>
+    </w:p>
+    <w:p>
+      <w:pPr>
+        <w:keepNext w:val="0"/>
+        <w:spacing w:after="80"/>
+      </w:pPr>
+      <w:r>
+        <w:rPr>
+          <w:b/>
+        </w:rPr>
+        <w:t xml:space="preserve">3.  </w:t>
+      </w:r>
+      <w:r>
         <w:t>Adjust the report: include/exclude fields, reorder columns and rename field labels to your house standard.</w:t>
       </w:r>
     </w:p>
     <w:p>
+      <w:pPr>
+        <w:keepNext w:val="0"/>
+      </w:pPr>
       <w:r>
         <w:rPr>
           <w:rFonts w:ascii="Consolas" w:hAnsi="Consolas"/>
@@ -3330,19 +3924,23 @@
     </w:p>
     <w:p>
       <w:pPr>
+        <w:keepNext w:val="0"/>
         <w:spacing w:after="80"/>
       </w:pPr>
       <w:r>
         <w:rPr>
           <w:b/>
         </w:rPr>
-        <w:t xml:space="preserve">3.  </w:t>
+        <w:t xml:space="preserve">4.  </w:t>
       </w:r>
       <w:r>
         <w:t>Save the settings as a format file so the same report can be re-run in one click next time.</w:t>
       </w:r>
     </w:p>
     <w:p>
+      <w:pPr>
+        <w:keepNext w:val="0"/>
+      </w:pPr>
       <w:r>
         <w:rPr>
           <w:rFonts w:ascii="Consolas" w:hAnsi="Consolas"/>
@@ -3354,19 +3952,23 @@
     </w:p>
     <w:p>
       <w:pPr>
+        <w:keepNext w:val="0"/>
         <w:spacing w:after="80"/>
       </w:pPr>
       <w:r>
         <w:rPr>
           <w:b/>
         </w:rPr>
-        <w:t xml:space="preserve">4.  </w:t>
+        <w:t xml:space="preserve">5.  </w:t>
       </w:r>
       <w:r>
         <w:t>Insert the report on the drawing as a table (Put on Drawing) using a table style.</w:t>
       </w:r>
     </w:p>
     <w:p>
+      <w:pPr>
+        <w:keepNext w:val="0"/>
+      </w:pPr>
       <w:r>
         <w:rPr>
           <w:rFonts w:ascii="Consolas" w:hAnsi="Consolas"/>
@@ -3378,19 +3980,23 @@
     </w:p>
     <w:p>
       <w:pPr>
+        <w:keepNext w:val="0"/>
         <w:spacing w:after="80"/>
       </w:pPr>
       <w:r>
         <w:rPr>
           <w:b/>
         </w:rPr>
-        <w:t xml:space="preserve">5.  </w:t>
+        <w:t xml:space="preserve">6.  </w:t>
       </w:r>
       <w:r>
         <w:t>Export the same report to a file for procurement (CSV/XLS).</w:t>
       </w:r>
     </w:p>
     <w:p>
+      <w:pPr>
+        <w:keepNext w:val="0"/>
+      </w:pPr>
       <w:r>
         <w:rPr>
           <w:rFonts w:ascii="Consolas" w:hAnsi="Consolas"/>
@@ -3402,19 +4008,23 @@
     </w:p>
     <w:p>
       <w:pPr>
+        <w:keepNext w:val="0"/>
         <w:spacing w:after="80"/>
       </w:pPr>
       <w:r>
         <w:rPr>
           <w:b/>
         </w:rPr>
-        <w:t xml:space="preserve">6.  </w:t>
+        <w:t xml:space="preserve">7.  </w:t>
       </w:r>
       <w:r>
         <w:t>Run a Wire From/To report and compare it against the wiring you created in Lab 4; open the supplied table drawings to see linked tables.</w:t>
       </w:r>
     </w:p>
     <w:p>
+      <w:pPr>
+        <w:keepNext w:val="0"/>
+      </w:pPr>
       <w:r>
         <w:rPr>
           <w:rFonts w:ascii="Consolas" w:hAnsi="Consolas"/>
@@ -3425,6 +4035,9 @@
       </w:r>
     </w:p>
     <w:p>
+      <w:pPr>
+        <w:keepNext/>
+      </w:pPr>
       <w:r>
         <w:rPr>
           <w:b/>
@@ -3474,6 +4087,9 @@
       </w:r>
     </w:p>
     <w:p>
+      <w:pPr>
+        <w:keepNext/>
+      </w:pPr>
       <w:r>
         <w:rPr>
           <w:b/>
@@ -3492,7 +4108,7 @@
       <w:r>
         <w:drawing>
           <wp:inline xmlns:a="http://schemas.openxmlformats.org/drawingml/2006/main" xmlns:pic="http://schemas.openxmlformats.org/drawingml/2006/picture">
-            <wp:extent cx="5029200" cy="3562350"/>
+            <wp:extent cx="4389120" cy="3108960"/>
             <wp:docPr id="9" name="Picture 9"/>
             <wp:cNvGraphicFramePr>
               <a:graphicFrameLocks noChangeAspect="1"/>
@@ -3513,7 +4129,7 @@
                   <pic:spPr>
                     <a:xfrm>
                       <a:off x="0" y="0"/>
-                      <a:ext cx="5029200" cy="3562350"/>
+                      <a:ext cx="4389120" cy="3108960"/>
                     </a:xfrm>
                     <a:prstGeom prst="rect"/>
                   </pic:spPr>
@@ -3535,6 +4151,9 @@
       </w:r>
     </w:p>
     <w:p>
+      <w:pPr>
+        <w:keepNext/>
+      </w:pPr>
       <w:r>
         <w:rPr>
           <w:b/>
@@ -3561,6 +4180,32 @@
       </w:r>
     </w:p>
     <w:p>
+      <w:pPr>
+        <w:pStyle w:val="ListBullet"/>
+      </w:pPr>
+      <w:r>
+        <w:t>autodesk-electrical-sample-project/ — AutoCAD Electrical multi-sheet sample project with title-block data (wddemo.wdp) (controlled course-delivery package; omitted from public GitHub)</w:t>
+      </w:r>
+    </w:p>
+    <w:p>
+      <w:r>
+        <w:rPr>
+          <w:b/>
+          <w:color w:val="1F6FEB"/>
+        </w:rPr>
+        <w:t xml:space="preserve">Note: </w:t>
+      </w:r>
+      <w:r>
+        <w:rPr>
+          <w:sz w:val="20"/>
+        </w:rPr>
+        <w:t>Compatibility safeguard: work on a complete copy, allow the current Electrical toolset to update that copy if prompted, remap any missing legacy AutoCAD Electrical 2015 library paths, and keep the supplied package unchanged.</w:t>
+      </w:r>
+    </w:p>
+    <w:p>
+      <w:pPr>
+        <w:keepNext/>
+      </w:pPr>
       <w:r>
         <w:rPr>
           <w:b/>
@@ -3572,6 +4217,7 @@
     </w:p>
     <w:p>
       <w:pPr>
+        <w:keepNext/>
         <w:spacing w:after="80"/>
       </w:pPr>
       <w:r>
@@ -3581,10 +4227,41 @@
         <w:t xml:space="preserve">1.  </w:t>
       </w:r>
       <w:r>
+        <w:t>Open a working copy of the supplied `wddemo.wdp`, confirm all nine sheets and title-block data resolve, and use that project for the multi-sheet publish check.</w:t>
+      </w:r>
+    </w:p>
+    <w:p>
+      <w:pPr>
+        <w:keepNext/>
+      </w:pPr>
+      <w:r>
+        <w:rPr>
+          <w:rFonts w:ascii="Consolas" w:hAnsi="Consolas"/>
+          <w:color w:val="0B3060"/>
+          <w:sz w:val="19"/>
+        </w:rPr>
+        <w:t>AEPROJECT → Open Project → wddemo.wdp</w:t>
+      </w:r>
+    </w:p>
+    <w:p>
+      <w:pPr>
+        <w:keepNext/>
+        <w:spacing w:after="80"/>
+      </w:pPr>
+      <w:r>
+        <w:rPr>
+          <w:b/>
+        </w:rPr>
+        <w:t xml:space="preserve">2.  </w:t>
+      </w:r>
+      <w:r>
         <w:t>Open the External References palette and attach a DWG as an xref to see how reference files are managed.</w:t>
       </w:r>
     </w:p>
     <w:p>
+      <w:pPr>
+        <w:keepNext w:val="0"/>
+      </w:pPr>
       <w:r>
         <w:rPr>
           <w:rFonts w:ascii="Consolas" w:hAnsi="Consolas"/>
@@ -3596,19 +4273,23 @@
     </w:p>
     <w:p>
       <w:pPr>
+        <w:keepNext w:val="0"/>
         <w:spacing w:after="80"/>
       </w:pPr>
       <w:r>
         <w:rPr>
           <w:b/>
         </w:rPr>
-        <w:t xml:space="preserve">2.  </w:t>
+        <w:t xml:space="preserve">3.  </w:t>
       </w:r>
       <w:r>
         <w:t>Open 1-12_Using_Layout_Tabs.dwg and review its layout tabs — plotting always happens from a layout with a page setup.</w:t>
       </w:r>
     </w:p>
     <w:p>
+      <w:pPr>
+        <w:keepNext w:val="0"/>
+      </w:pPr>
       <w:r>
         <w:rPr>
           <w:rFonts w:ascii="Consolas" w:hAnsi="Consolas"/>
@@ -3620,19 +4301,23 @@
     </w:p>
     <w:p>
       <w:pPr>
+        <w:keepNext w:val="0"/>
         <w:spacing w:after="80"/>
       </w:pPr>
       <w:r>
         <w:rPr>
           <w:b/>
         </w:rPr>
-        <w:t xml:space="preserve">3.  </w:t>
+        <w:t xml:space="preserve">4.  </w:t>
       </w:r>
       <w:r>
         <w:t>Plot the active drawing to PDF at A3 size from the Plot dialog (printer: AutoCAD PDF, paper: ISO A3).</w:t>
       </w:r>
     </w:p>
     <w:p>
+      <w:pPr>
+        <w:keepNext w:val="0"/>
+      </w:pPr>
       <w:r>
         <w:rPr>
           <w:rFonts w:ascii="Consolas" w:hAnsi="Consolas"/>
@@ -3644,19 +4329,23 @@
     </w:p>
     <w:p>
       <w:pPr>
+        <w:keepNext w:val="0"/>
         <w:spacing w:after="80"/>
       </w:pPr>
       <w:r>
         <w:rPr>
           <w:b/>
         </w:rPr>
-        <w:t xml:space="preserve">4.  </w:t>
+        <w:t xml:space="preserve">5.  </w:t>
       </w:r>
       <w:r>
         <w:t>From Project Manager, choose Publish/Plot → Plot Project and select the sheets to output.</w:t>
       </w:r>
     </w:p>
     <w:p>
+      <w:pPr>
+        <w:keepNext w:val="0"/>
+      </w:pPr>
       <w:r>
         <w:rPr>
           <w:rFonts w:ascii="Consolas" w:hAnsi="Consolas"/>
@@ -3668,19 +4357,23 @@
     </w:p>
     <w:p>
       <w:pPr>
+        <w:keepNext w:val="0"/>
         <w:spacing w:after="80"/>
       </w:pPr>
       <w:r>
         <w:rPr>
           <w:b/>
         </w:rPr>
-        <w:t xml:space="preserve">5.  </w:t>
+        <w:t xml:space="preserve">6.  </w:t>
       </w:r>
       <w:r>
         <w:t>Publish the project to a single multi-sheet PDF with Include Hyperlinks checked — cross-references become clickable links.</w:t>
       </w:r>
     </w:p>
     <w:p>
+      <w:pPr>
+        <w:keepNext w:val="0"/>
+      </w:pPr>
       <w:r>
         <w:rPr>
           <w:rFonts w:ascii="Consolas" w:hAnsi="Consolas"/>
@@ -3692,19 +4385,23 @@
     </w:p>
     <w:p>
       <w:pPr>
+        <w:keepNext w:val="0"/>
         <w:spacing w:after="80"/>
       </w:pPr>
       <w:r>
         <w:rPr>
           <w:b/>
         </w:rPr>
-        <w:t xml:space="preserve">6.  </w:t>
+        <w:t xml:space="preserve">7.  </w:t>
       </w:r>
       <w:r>
         <w:t>Open the PDF and click a parent's cross-reference to jump to its child; confirm the title block shows the plot date.</w:t>
       </w:r>
     </w:p>
     <w:p>
+      <w:pPr>
+        <w:keepNext w:val="0"/>
+      </w:pPr>
       <w:r>
         <w:rPr>
           <w:rFonts w:ascii="Consolas" w:hAnsi="Consolas"/>
@@ -3715,6 +4412,9 @@
       </w:r>
     </w:p>
     <w:p>
+      <w:pPr>
+        <w:keepNext/>
+      </w:pPr>
       <w:r>
         <w:rPr>
           <w:b/>
@@ -3775,14 +4475,6 @@
       </w:pPr>
       <w:r>
         <w:t>Both assessments are open book: bring the slides and this Learner Guide.</w:t>
-      </w:r>
-    </w:p>
-    <w:p>
-      <w:pPr>
-        <w:pStyle w:val="ListBullet"/>
-      </w:pPr>
-      <w:r>
-        <w:t>Sharpen your readiness with the Tertiary Infotech practice exams: https://exams.tertiaryinfotech.com/</w:t>
       </w:r>
     </w:p>
     <w:p>

</xml_diff>